<commit_message>
update report with final commit hashes
</commit_message>
<xml_diff>
--- a/ML_Activity3_DuvanLozano.docx
+++ b/ML_Activity3_DuvanLozano.docx
@@ -9833,7 +9833,7 @@
                 <w:color w:val="FFFFFF"/>
                 <w:sz w:val="20"/>
               </w:rPr>
-              <w:t>Status</w:t>
+              <w:t>Commits</w:t>
             </w:r>
           </w:p>
         </w:tc>
@@ -9877,7 +9877,7 @@
               <w:rPr>
                 <w:sz w:val="19"/>
               </w:rPr>
-              <w:t>[ fill in commit count after final push ]</w:t>
+              <w:t>6</w:t>
             </w:r>
           </w:p>
         </w:tc>
@@ -9904,10 +9904,10 @@
         <w:rPr>
           <w:rFonts w:ascii="Calibri" w:hAnsi="Calibri"/>
           <w:b w:val="0"/>
-          <w:i/>
+          <w:i w:val="0"/>
           <w:sz w:val="22"/>
         </w:rPr>
-        <w:t>Representative commits on branch activityClouster (fill in the final hashes after pushing):</w:t>
+        <w:t>Progressive commits on branch activityClouster:</w:t>
       </w:r>
     </w:p>
     <w:tbl>
@@ -9968,7 +9968,7 @@
               <w:rPr>
                 <w:sz w:val="19"/>
               </w:rPr>
-              <w:t>[ hash ]</w:t>
+              <w:t>3265ce5</w:t>
             </w:r>
           </w:p>
         </w:tc>
@@ -9982,7 +9982,7 @@
               <w:rPr>
                 <w:sz w:val="19"/>
               </w:rPr>
-              <w:t>add Clustering.py with manual + sklearn K-Means</w:t>
+              <w:t>add Clustering module with manual and sklearn K-Means</w:t>
             </w:r>
           </w:p>
         </w:tc>
@@ -9998,7 +9998,7 @@
               <w:rPr>
                 <w:sz w:val="19"/>
               </w:rPr>
-              <w:t>[ hash ]</w:t>
+              <w:t>3550287</w:t>
             </w:r>
           </w:p>
         </w:tc>
@@ -10028,7 +10028,7 @@
               <w:rPr>
                 <w:sz w:val="19"/>
               </w:rPr>
-              <w:t>[ hash ]</w:t>
+              <w:t>d5248bd</w:t>
             </w:r>
           </w:p>
         </w:tc>
@@ -10058,7 +10058,7 @@
               <w:rPr>
                 <w:sz w:val="19"/>
               </w:rPr>
-              <w:t>[ hash ]</w:t>
+              <w:t>817426c</w:t>
             </w:r>
           </w:p>
         </w:tc>
@@ -10088,7 +10088,7 @@
               <w:rPr>
                 <w:sz w:val="19"/>
               </w:rPr>
-              <w:t>[ hash ]</w:t>
+              <w:t>9ded6ed</w:t>
             </w:r>
           </w:p>
         </w:tc>
@@ -10102,7 +10102,7 @@
               <w:rPr>
                 <w:sz w:val="19"/>
               </w:rPr>
-              <w:t>add unsupervised routes to Flask app</w:t>
+              <w:t>add unsupervised routes and update navbar across all pages</w:t>
             </w:r>
           </w:p>
         </w:tc>
@@ -10118,7 +10118,7 @@
               <w:rPr>
                 <w:sz w:val="19"/>
               </w:rPr>
-              <w:t>[ hash ]</w:t>
+              <w:t>293b774</w:t>
             </w:r>
           </w:p>
         </w:tc>
@@ -10132,7 +10132,7 @@
               <w:rPr>
                 <w:sz w:val="19"/>
               </w:rPr>
-              <w:t>update navbar across all templates with Unsupervised Learning menu</w:t>
+              <w:t>add Activity 3 report document and generator</w:t>
             </w:r>
           </w:p>
         </w:tc>

</xml_diff>